<commit_message>
Edits to 2, 3, 8, 9 plus copyright edits to others
</commit_message>
<xml_diff>
--- a/Front Matter/Template/8_Front-Matter copy.docx
+++ b/Front Matter/Template/8_Front-Matter copy.docx
@@ -3638,22 +3638,114 @@
     </w:p>
     <w:p>
       <w:pPr>
-        <w:jc w:val="right"/>
-        <w:rPr>
-          <w:rFonts w:ascii="Noto Serif SC" w:eastAsia="Noto Serif SC" w:hAnsi="Noto Serif SC" w:cs="Noto Serif"/>
-          <w:sz w:val="24"/>
-          <w:szCs w:val="24"/>
-          <w:lang w:val="en-US"/>
-        </w:rPr>
-      </w:pPr>
-      <w:r>
-        <w:rPr>
-          <w:rFonts w:ascii="Noto Serif SC" w:eastAsia="Noto Serif SC" w:hAnsi="Noto Serif SC" w:cs="Noto Serif"/>
-          <w:sz w:val="24"/>
-          <w:szCs w:val="24"/>
-          <w:lang w:val="en-US"/>
-        </w:rPr>
-        <w:t>梆笛 I, II (</w:t>
+        <w:rPr>
+          <w:rFonts w:ascii="Noto Serif SC" w:eastAsia="Noto Serif SC" w:hAnsi="Noto Serif SC" w:cs="Noto Serif"/>
+          <w:sz w:val="24"/>
+          <w:szCs w:val="24"/>
+          <w:lang w:val="en-US"/>
+        </w:rPr>
+      </w:pPr>
+      <w:r>
+        <w:rPr>
+          <w:rFonts w:ascii="Noto Serif SC" w:eastAsia="Noto Serif SC" w:hAnsi="Noto Serif SC" w:cs="Noto Serif" w:hint="eastAsia"/>
+          <w:sz w:val="24"/>
+          <w:szCs w:val="24"/>
+          <w:lang w:val="en-US"/>
+        </w:rPr>
+        <w:t xml:space="preserve">1 梆笛 </w:t>
+      </w:r>
+      <w:r>
+        <w:rPr>
+          <w:rFonts w:ascii="Noto Serif SC" w:eastAsia="Noto Serif SC" w:hAnsi="Noto Serif SC" w:cs="Noto Serif"/>
+          <w:sz w:val="24"/>
+          <w:szCs w:val="24"/>
+          <w:lang w:val="en-US"/>
+        </w:rPr>
+        <w:t>| 1 Bang Di</w:t>
+      </w:r>
+    </w:p>
+    <w:p>
+      <w:pPr>
+        <w:rPr>
+          <w:rFonts w:ascii="Noto Serif SC" w:eastAsia="Noto Serif SC" w:hAnsi="Noto Serif SC" w:cs="Noto Serif"/>
+          <w:sz w:val="24"/>
+          <w:szCs w:val="24"/>
+          <w:lang w:val="en-US"/>
+        </w:rPr>
+      </w:pPr>
+      <w:r>
+        <w:rPr>
+          <w:rFonts w:ascii="Noto Serif SC" w:eastAsia="Noto Serif SC" w:hAnsi="Noto Serif SC" w:cs="Noto Serif" w:hint="eastAsia"/>
+          <w:sz w:val="24"/>
+          <w:szCs w:val="24"/>
+          <w:lang w:val="en-US"/>
+        </w:rPr>
+        <w:t xml:space="preserve">2 曲笛 </w:t>
+      </w:r>
+      <w:r>
+        <w:rPr>
+          <w:rFonts w:ascii="Noto Serif SC" w:eastAsia="Noto Serif SC" w:hAnsi="Noto Serif SC" w:cs="Noto Serif"/>
+          <w:sz w:val="24"/>
+          <w:szCs w:val="24"/>
+          <w:lang w:val="en-US"/>
+        </w:rPr>
+        <w:t>| 2 Qu Di</w:t>
+      </w:r>
+    </w:p>
+    <w:p>
+      <w:pPr>
+        <w:rPr>
+          <w:rFonts w:ascii="Noto Serif SC" w:eastAsia="Noto Serif SC" w:hAnsi="Noto Serif SC" w:cs="Noto Serif"/>
+          <w:sz w:val="24"/>
+          <w:szCs w:val="24"/>
+          <w:lang w:val="en-US"/>
+        </w:rPr>
+      </w:pPr>
+      <w:r>
+        <w:rPr>
+          <w:rFonts w:ascii="Noto Serif SC" w:eastAsia="Noto Serif SC" w:hAnsi="Noto Serif SC" w:cs="Noto Serif" w:hint="eastAsia"/>
+          <w:sz w:val="24"/>
+          <w:szCs w:val="24"/>
+          <w:lang w:val="en-US"/>
+        </w:rPr>
+        <w:t xml:space="preserve">2 新笛 </w:t>
+      </w:r>
+      <w:r>
+        <w:rPr>
+          <w:rFonts w:ascii="Noto Serif SC" w:eastAsia="Noto Serif SC" w:hAnsi="Noto Serif SC" w:cs="Noto Serif"/>
+          <w:sz w:val="24"/>
+          <w:szCs w:val="24"/>
+          <w:lang w:val="en-US"/>
+        </w:rPr>
+        <w:t>| 2 Xin Di</w:t>
+      </w:r>
+    </w:p>
+    <w:p>
+      <w:pPr>
+        <w:rPr>
+          <w:rFonts w:ascii="Noto Serif SC" w:eastAsia="Noto Serif SC" w:hAnsi="Noto Serif SC" w:cs="Noto Serif"/>
+          <w:sz w:val="24"/>
+          <w:szCs w:val="24"/>
+          <w:lang w:val="en-US"/>
+        </w:rPr>
+      </w:pPr>
+      <w:r>
+        <w:rPr>
+          <w:rFonts w:ascii="Noto Serif SC" w:eastAsia="Noto Serif SC" w:hAnsi="Noto Serif SC" w:cs="Noto Serif" w:hint="eastAsia"/>
+          <w:sz w:val="24"/>
+          <w:szCs w:val="24"/>
+          <w:lang w:val="en-US"/>
+        </w:rPr>
+        <w:t xml:space="preserve">2 高音笙 </w:t>
+      </w:r>
+      <w:r>
+        <w:rPr>
+          <w:rFonts w:ascii="Noto Serif SC" w:eastAsia="Noto Serif SC" w:hAnsi="Noto Serif SC" w:cs="Noto Serif"/>
+          <w:sz w:val="24"/>
+          <w:szCs w:val="24"/>
+          <w:lang w:val="en-US"/>
+        </w:rPr>
+        <w:t xml:space="preserve">| 2 </w:t>
       </w:r>
       <w:proofErr w:type="spellStart"/>
       <w:r>
@@ -3663,7 +3755,7 @@
           <w:szCs w:val="24"/>
           <w:lang w:val="en-US"/>
         </w:rPr>
-        <w:t>Bangdi</w:t>
+        <w:t>Gaoyin</w:t>
       </w:r>
       <w:proofErr w:type="spellEnd"/>
       <w:r>
@@ -3673,27 +3765,35 @@
           <w:szCs w:val="24"/>
           <w:lang w:val="en-US"/>
         </w:rPr>
-        <w:t xml:space="preserve"> I, II)</w:t>
-      </w:r>
-    </w:p>
-    <w:p>
-      <w:pPr>
-        <w:jc w:val="right"/>
-        <w:rPr>
-          <w:rFonts w:ascii="Noto Serif SC" w:eastAsia="Noto Serif SC" w:hAnsi="Noto Serif SC" w:cs="Noto Serif"/>
-          <w:sz w:val="24"/>
-          <w:szCs w:val="24"/>
-          <w:lang w:val="en-US"/>
-        </w:rPr>
-      </w:pPr>
-      <w:r>
-        <w:rPr>
-          <w:rFonts w:ascii="Noto Serif SC" w:eastAsia="Noto Serif SC" w:hAnsi="Noto Serif SC" w:cs="Noto Serif"/>
-          <w:sz w:val="24"/>
-          <w:szCs w:val="24"/>
-          <w:lang w:val="en-US"/>
-        </w:rPr>
-        <w:t>曲笛 I, II (</w:t>
+        <w:t xml:space="preserve"> Sheng</w:t>
+      </w:r>
+    </w:p>
+    <w:p>
+      <w:pPr>
+        <w:rPr>
+          <w:rFonts w:ascii="Noto Serif SC" w:eastAsia="Noto Serif SC" w:hAnsi="Noto Serif SC" w:cs="Noto Serif"/>
+          <w:sz w:val="24"/>
+          <w:szCs w:val="24"/>
+          <w:lang w:val="en-US"/>
+        </w:rPr>
+      </w:pPr>
+      <w:r>
+        <w:rPr>
+          <w:rFonts w:ascii="Noto Serif SC" w:eastAsia="Noto Serif SC" w:hAnsi="Noto Serif SC" w:cs="Noto Serif" w:hint="eastAsia"/>
+          <w:sz w:val="24"/>
+          <w:szCs w:val="24"/>
+          <w:lang w:val="en-US"/>
+        </w:rPr>
+        <w:t xml:space="preserve">2 中音笙 </w:t>
+      </w:r>
+      <w:r>
+        <w:rPr>
+          <w:rFonts w:ascii="Noto Serif SC" w:eastAsia="Noto Serif SC" w:hAnsi="Noto Serif SC" w:cs="Noto Serif"/>
+          <w:sz w:val="24"/>
+          <w:szCs w:val="24"/>
+          <w:lang w:val="en-US"/>
+        </w:rPr>
+        <w:t xml:space="preserve">| 2 </w:t>
       </w:r>
       <w:proofErr w:type="spellStart"/>
       <w:r>
@@ -3703,7 +3803,7 @@
           <w:szCs w:val="24"/>
           <w:lang w:val="en-US"/>
         </w:rPr>
-        <w:t>Qudi</w:t>
+        <w:t>Zhongyin</w:t>
       </w:r>
       <w:proofErr w:type="spellEnd"/>
       <w:r>
@@ -3713,38 +3813,35 @@
           <w:szCs w:val="24"/>
           <w:lang w:val="en-US"/>
         </w:rPr>
-        <w:t xml:space="preserve"> I, II)</w:t>
-      </w:r>
-    </w:p>
-    <w:p>
-      <w:pPr>
-        <w:jc w:val="right"/>
-        <w:rPr>
-          <w:rFonts w:ascii="Noto Serif SC" w:eastAsia="Noto Serif SC" w:hAnsi="Noto Serif SC" w:cs="Noto Serif"/>
-          <w:sz w:val="24"/>
-          <w:szCs w:val="24"/>
-          <w:lang w:val="en-US"/>
-        </w:rPr>
-      </w:pPr>
-    </w:p>
-    <w:p>
-      <w:pPr>
-        <w:jc w:val="right"/>
-        <w:rPr>
-          <w:rFonts w:ascii="Noto Serif SC" w:eastAsia="Noto Serif SC" w:hAnsi="Noto Serif SC" w:cs="Noto Serif"/>
-          <w:sz w:val="24"/>
-          <w:szCs w:val="24"/>
-          <w:lang w:val="en-US"/>
-        </w:rPr>
-      </w:pPr>
-      <w:r>
-        <w:rPr>
-          <w:rFonts w:ascii="Noto Serif SC" w:eastAsia="Noto Serif SC" w:hAnsi="Noto Serif SC" w:cs="Noto Serif"/>
-          <w:sz w:val="24"/>
-          <w:szCs w:val="24"/>
-          <w:lang w:val="en-US"/>
-        </w:rPr>
-        <w:t>高音笙 I, II (</w:t>
+        <w:t xml:space="preserve"> Sheng</w:t>
+      </w:r>
+    </w:p>
+    <w:p>
+      <w:pPr>
+        <w:rPr>
+          <w:rFonts w:ascii="Noto Serif SC" w:eastAsia="Noto Serif SC" w:hAnsi="Noto Serif SC" w:cs="Noto Serif"/>
+          <w:sz w:val="24"/>
+          <w:szCs w:val="24"/>
+          <w:lang w:val="en-US"/>
+        </w:rPr>
+      </w:pPr>
+      <w:r>
+        <w:rPr>
+          <w:rFonts w:ascii="Noto Serif SC" w:eastAsia="Noto Serif SC" w:hAnsi="Noto Serif SC" w:cs="Noto Serif" w:hint="eastAsia"/>
+          <w:sz w:val="24"/>
+          <w:szCs w:val="24"/>
+          <w:lang w:val="en-US"/>
+        </w:rPr>
+        <w:t xml:space="preserve">1 低音笙 </w:t>
+      </w:r>
+      <w:r>
+        <w:rPr>
+          <w:rFonts w:ascii="Noto Serif SC" w:eastAsia="Noto Serif SC" w:hAnsi="Noto Serif SC" w:cs="Noto Serif"/>
+          <w:sz w:val="24"/>
+          <w:szCs w:val="24"/>
+          <w:lang w:val="en-US"/>
+        </w:rPr>
+        <w:t xml:space="preserve">| 1 </w:t>
       </w:r>
       <w:proofErr w:type="spellStart"/>
       <w:r>
@@ -3754,6 +3851,54 @@
           <w:szCs w:val="24"/>
           <w:lang w:val="en-US"/>
         </w:rPr>
+        <w:t>Diyin</w:t>
+      </w:r>
+      <w:proofErr w:type="spellEnd"/>
+      <w:r>
+        <w:rPr>
+          <w:rFonts w:ascii="Noto Serif SC" w:eastAsia="Noto Serif SC" w:hAnsi="Noto Serif SC" w:cs="Noto Serif"/>
+          <w:sz w:val="24"/>
+          <w:szCs w:val="24"/>
+          <w:lang w:val="en-US"/>
+        </w:rPr>
+        <w:t xml:space="preserve"> Sheng</w:t>
+      </w:r>
+    </w:p>
+    <w:p>
+      <w:pPr>
+        <w:rPr>
+          <w:rFonts w:ascii="Noto Serif SC" w:eastAsia="Noto Serif SC" w:hAnsi="Noto Serif SC" w:cs="Noto Serif"/>
+          <w:sz w:val="24"/>
+          <w:szCs w:val="24"/>
+          <w:lang w:val="en-US"/>
+        </w:rPr>
+      </w:pPr>
+      <w:r>
+        <w:rPr>
+          <w:rFonts w:ascii="Noto Serif SC" w:eastAsia="Noto Serif SC" w:hAnsi="Noto Serif SC" w:cs="Noto Serif" w:hint="eastAsia"/>
+          <w:sz w:val="24"/>
+          <w:szCs w:val="24"/>
+          <w:lang w:val="en-US"/>
+        </w:rPr>
+        <w:t xml:space="preserve">2 高音唢呐 </w:t>
+      </w:r>
+      <w:r>
+        <w:rPr>
+          <w:rFonts w:ascii="Noto Serif SC" w:eastAsia="Noto Serif SC" w:hAnsi="Noto Serif SC" w:cs="Noto Serif"/>
+          <w:sz w:val="24"/>
+          <w:szCs w:val="24"/>
+          <w:lang w:val="en-US"/>
+        </w:rPr>
+        <w:t xml:space="preserve">| 2 </w:t>
+      </w:r>
+      <w:proofErr w:type="spellStart"/>
+      <w:r>
+        <w:rPr>
+          <w:rFonts w:ascii="Noto Serif SC" w:eastAsia="Noto Serif SC" w:hAnsi="Noto Serif SC" w:cs="Noto Serif"/>
+          <w:sz w:val="24"/>
+          <w:szCs w:val="24"/>
+          <w:lang w:val="en-US"/>
+        </w:rPr>
         <w:t>Gaoyin</w:t>
       </w:r>
       <w:proofErr w:type="spellEnd"/>
@@ -3764,27 +3909,7 @@
           <w:szCs w:val="24"/>
           <w:lang w:val="en-US"/>
         </w:rPr>
-        <w:t xml:space="preserve"> Sheng I, II)</w:t>
-      </w:r>
-    </w:p>
-    <w:p>
-      <w:pPr>
-        <w:jc w:val="right"/>
-        <w:rPr>
-          <w:rFonts w:ascii="Noto Serif SC" w:eastAsia="Noto Serif SC" w:hAnsi="Noto Serif SC" w:cs="Noto Serif"/>
-          <w:sz w:val="24"/>
-          <w:szCs w:val="24"/>
-          <w:lang w:val="en-US"/>
-        </w:rPr>
-      </w:pPr>
-      <w:r>
-        <w:rPr>
-          <w:rFonts w:ascii="Noto Serif SC" w:eastAsia="Noto Serif SC" w:hAnsi="Noto Serif SC" w:cs="Noto Serif"/>
-          <w:sz w:val="24"/>
-          <w:szCs w:val="24"/>
-          <w:lang w:val="en-US"/>
-        </w:rPr>
-        <w:t>中音笙 (</w:t>
+        <w:t xml:space="preserve"> </w:t>
       </w:r>
       <w:proofErr w:type="spellStart"/>
       <w:r>
@@ -3794,6 +3919,45 @@
           <w:szCs w:val="24"/>
           <w:lang w:val="en-US"/>
         </w:rPr>
+        <w:t>Suona</w:t>
+      </w:r>
+      <w:proofErr w:type="spellEnd"/>
+    </w:p>
+    <w:p>
+      <w:pPr>
+        <w:rPr>
+          <w:rFonts w:ascii="Noto Serif SC" w:eastAsia="Noto Serif SC" w:hAnsi="Noto Serif SC" w:cs="Noto Serif"/>
+          <w:sz w:val="24"/>
+          <w:szCs w:val="24"/>
+          <w:lang w:val="en-US"/>
+        </w:rPr>
+      </w:pPr>
+      <w:r>
+        <w:rPr>
+          <w:rFonts w:ascii="Noto Serif SC" w:eastAsia="Noto Serif SC" w:hAnsi="Noto Serif SC" w:cs="Noto Serif" w:hint="eastAsia"/>
+          <w:sz w:val="24"/>
+          <w:szCs w:val="24"/>
+          <w:lang w:val="en-US"/>
+        </w:rPr>
+        <w:t xml:space="preserve">2 中音唢呐 </w:t>
+      </w:r>
+      <w:r>
+        <w:rPr>
+          <w:rFonts w:ascii="Noto Serif SC" w:eastAsia="Noto Serif SC" w:hAnsi="Noto Serif SC" w:cs="Noto Serif"/>
+          <w:sz w:val="24"/>
+          <w:szCs w:val="24"/>
+          <w:lang w:val="en-US"/>
+        </w:rPr>
+        <w:t xml:space="preserve">| 2 </w:t>
+      </w:r>
+      <w:proofErr w:type="spellStart"/>
+      <w:r>
+        <w:rPr>
+          <w:rFonts w:ascii="Noto Serif SC" w:eastAsia="Noto Serif SC" w:hAnsi="Noto Serif SC" w:cs="Noto Serif"/>
+          <w:sz w:val="24"/>
+          <w:szCs w:val="24"/>
+          <w:lang w:val="en-US"/>
+        </w:rPr>
         <w:t>Zhongyin</w:t>
       </w:r>
       <w:proofErr w:type="spellEnd"/>
@@ -3804,27 +3968,7 @@
           <w:szCs w:val="24"/>
           <w:lang w:val="en-US"/>
         </w:rPr>
-        <w:t xml:space="preserve"> Sheng)</w:t>
-      </w:r>
-    </w:p>
-    <w:p>
-      <w:pPr>
-        <w:jc w:val="right"/>
-        <w:rPr>
-          <w:rFonts w:ascii="Noto Serif SC" w:eastAsia="Noto Serif SC" w:hAnsi="Noto Serif SC" w:cs="Noto Serif"/>
-          <w:sz w:val="24"/>
-          <w:szCs w:val="24"/>
-          <w:lang w:val="en-US"/>
-        </w:rPr>
-      </w:pPr>
-      <w:r>
-        <w:rPr>
-          <w:rFonts w:ascii="Noto Serif SC" w:eastAsia="Noto Serif SC" w:hAnsi="Noto Serif SC" w:cs="Noto Serif"/>
-          <w:sz w:val="24"/>
-          <w:szCs w:val="24"/>
-          <w:lang w:val="en-US"/>
-        </w:rPr>
-        <w:t>低音笙 (</w:t>
+        <w:t xml:space="preserve"> </w:t>
       </w:r>
       <w:proofErr w:type="spellStart"/>
       <w:r>
@@ -3834,6 +3978,45 @@
           <w:szCs w:val="24"/>
           <w:lang w:val="en-US"/>
         </w:rPr>
+        <w:t>Suona</w:t>
+      </w:r>
+      <w:proofErr w:type="spellEnd"/>
+    </w:p>
+    <w:p>
+      <w:pPr>
+        <w:rPr>
+          <w:rFonts w:ascii="Noto Serif SC" w:eastAsia="Noto Serif SC" w:hAnsi="Noto Serif SC" w:cs="Noto Serif"/>
+          <w:sz w:val="24"/>
+          <w:szCs w:val="24"/>
+          <w:lang w:val="en-US"/>
+        </w:rPr>
+      </w:pPr>
+      <w:r>
+        <w:rPr>
+          <w:rFonts w:ascii="Noto Serif SC" w:eastAsia="Noto Serif SC" w:hAnsi="Noto Serif SC" w:cs="Noto Serif" w:hint="eastAsia"/>
+          <w:sz w:val="24"/>
+          <w:szCs w:val="24"/>
+          <w:lang w:val="en-US"/>
+        </w:rPr>
+        <w:t xml:space="preserve">1 低音唢呐 </w:t>
+      </w:r>
+      <w:r>
+        <w:rPr>
+          <w:rFonts w:ascii="Noto Serif SC" w:eastAsia="Noto Serif SC" w:hAnsi="Noto Serif SC" w:cs="Noto Serif"/>
+          <w:sz w:val="24"/>
+          <w:szCs w:val="24"/>
+          <w:lang w:val="en-US"/>
+        </w:rPr>
+        <w:t xml:space="preserve">| 1 </w:t>
+      </w:r>
+      <w:proofErr w:type="spellStart"/>
+      <w:r>
+        <w:rPr>
+          <w:rFonts w:ascii="Noto Serif SC" w:eastAsia="Noto Serif SC" w:hAnsi="Noto Serif SC" w:cs="Noto Serif"/>
+          <w:sz w:val="24"/>
+          <w:szCs w:val="24"/>
+          <w:lang w:val="en-US"/>
+        </w:rPr>
         <w:t>Diyin</w:t>
       </w:r>
       <w:proofErr w:type="spellEnd"/>
@@ -3844,38 +4027,7 @@
           <w:szCs w:val="24"/>
           <w:lang w:val="en-US"/>
         </w:rPr>
-        <w:t xml:space="preserve"> Sheng)</w:t>
-      </w:r>
-    </w:p>
-    <w:p>
-      <w:pPr>
-        <w:jc w:val="right"/>
-        <w:rPr>
-          <w:rFonts w:ascii="Noto Serif SC" w:eastAsia="Noto Serif SC" w:hAnsi="Noto Serif SC" w:cs="Noto Serif"/>
-          <w:sz w:val="24"/>
-          <w:szCs w:val="24"/>
-          <w:lang w:val="en-US"/>
-        </w:rPr>
-      </w:pPr>
-    </w:p>
-    <w:p>
-      <w:pPr>
-        <w:jc w:val="right"/>
-        <w:rPr>
-          <w:rFonts w:ascii="Noto Serif SC" w:eastAsia="Noto Serif SC" w:hAnsi="Noto Serif SC" w:cs="Noto Serif"/>
-          <w:sz w:val="24"/>
-          <w:szCs w:val="24"/>
-          <w:lang w:val="en-US"/>
-        </w:rPr>
-      </w:pPr>
-      <w:r>
-        <w:rPr>
-          <w:rFonts w:ascii="Noto Serif SC" w:eastAsia="Noto Serif SC" w:hAnsi="Noto Serif SC" w:cs="Noto Serif"/>
-          <w:sz w:val="24"/>
-          <w:szCs w:val="24"/>
-          <w:lang w:val="en-US"/>
-        </w:rPr>
-        <w:t>高音唢呐 I, II (</w:t>
+        <w:t xml:space="preserve"> </w:t>
       </w:r>
       <w:proofErr w:type="spellStart"/>
       <w:r>
@@ -3885,18 +4037,95 @@
           <w:szCs w:val="24"/>
           <w:lang w:val="en-US"/>
         </w:rPr>
-        <w:t>Gaoyin</w:t>
+        <w:t>Suona</w:t>
       </w:r>
       <w:proofErr w:type="spellEnd"/>
-      <w:r>
-        <w:rPr>
-          <w:rFonts w:ascii="Noto Serif SC" w:eastAsia="Noto Serif SC" w:hAnsi="Noto Serif SC" w:cs="Noto Serif"/>
+    </w:p>
+    <w:p>
+      <w:pPr>
+        <w:rPr>
+          <w:rFonts w:ascii="Noto Serif SC" w:eastAsia="Noto Serif SC" w:hAnsi="Noto Serif SC" w:cs="Noto Serif"/>
+          <w:sz w:val="24"/>
+          <w:szCs w:val="24"/>
+          <w:lang w:val="en-US"/>
+        </w:rPr>
+      </w:pPr>
+    </w:p>
+    <w:p>
+      <w:pPr>
+        <w:rPr>
+          <w:rFonts w:ascii="Noto Serif SC" w:eastAsia="Noto Serif SC" w:hAnsi="Noto Serif SC" w:cs="Noto Serif"/>
+          <w:sz w:val="24"/>
+          <w:szCs w:val="24"/>
+          <w:lang w:val="en-US"/>
+        </w:rPr>
+      </w:pPr>
+      <w:r>
+        <w:rPr>
+          <w:rFonts w:ascii="Noto Serif SC" w:eastAsia="Noto Serif SC" w:hAnsi="Noto Serif SC" w:cs="Noto Serif" w:hint="eastAsia"/>
+          <w:sz w:val="24"/>
+          <w:szCs w:val="24"/>
+          <w:lang w:val="en-US"/>
+        </w:rPr>
+        <w:t>2 扬琴</w:t>
+      </w:r>
+      <w:proofErr w:type="spellStart"/>
+      <w:r>
+        <w:rPr>
+          <w:rFonts w:ascii="Noto Serif SC" w:eastAsia="Noto Serif SC" w:hAnsi="Noto Serif SC" w:cs="Noto Serif" w:hint="eastAsia"/>
           <w:sz w:val="24"/>
           <w:szCs w:val="24"/>
           <w:lang w:val="en-US"/>
         </w:rPr>
         <w:t xml:space="preserve"> </w:t>
       </w:r>
+      <w:r>
+        <w:rPr>
+          <w:rFonts w:ascii="Noto Serif SC" w:eastAsia="Noto Serif SC" w:hAnsi="Noto Serif SC" w:cs="Noto Serif"/>
+          <w:sz w:val="24"/>
+          <w:szCs w:val="24"/>
+          <w:lang w:val="en-US"/>
+        </w:rPr>
+        <w:t xml:space="preserve">| 2 </w:t>
+      </w:r>
+      <w:proofErr w:type="spellEnd"/>
+      <w:r>
+        <w:rPr>
+          <w:rFonts w:ascii="Noto Serif SC" w:eastAsia="Noto Serif SC" w:hAnsi="Noto Serif SC" w:cs="Noto Serif"/>
+          <w:sz w:val="24"/>
+          <w:szCs w:val="24"/>
+          <w:lang w:val="en-US"/>
+        </w:rPr>
+        <w:t>Yangqin</w:t>
+      </w:r>
+    </w:p>
+    <w:p>
+      <w:pPr>
+        <w:rPr>
+          <w:rFonts w:ascii="Noto Serif SC" w:eastAsia="Noto Serif SC" w:hAnsi="Noto Serif SC" w:cs="Noto Serif"/>
+          <w:sz w:val="24"/>
+          <w:szCs w:val="24"/>
+          <w:lang w:val="en-US"/>
+        </w:rPr>
+      </w:pPr>
+      <w:r>
+        <w:rPr>
+          <w:rFonts w:ascii="Noto Serif SC" w:eastAsia="Noto Serif SC" w:hAnsi="Noto Serif SC" w:cs="Noto Serif" w:hint="eastAsia"/>
+          <w:sz w:val="24"/>
+          <w:szCs w:val="24"/>
+          <w:lang w:val="en-US"/>
+        </w:rPr>
+        <w:t xml:space="preserve">2 柳琴 </w:t>
+      </w:r>
+      <w:r>
+        <w:rPr>
+          <w:rFonts w:ascii="Noto Serif SC" w:eastAsia="Noto Serif SC" w:hAnsi="Noto Serif SC" w:cs="Noto Serif"/>
+          <w:sz w:val="24"/>
+          <w:szCs w:val="24"/>
+          <w:lang w:val="en-US"/>
+        </w:rPr>
+        <w:t xml:space="preserve">| 2 </w:t>
+      </w:r>
       <w:proofErr w:type="spellStart"/>
       <w:r>
         <w:rPr>
@@ -3905,37 +4134,176 @@
           <w:szCs w:val="24"/>
           <w:lang w:val="en-US"/>
         </w:rPr>
-        <w:t>Suona</w:t>
+        <w:t>Liuqin</w:t>
       </w:r>
       <w:proofErr w:type="spellEnd"/>
-      <w:r>
-        <w:rPr>
-          <w:rFonts w:ascii="Noto Serif SC" w:eastAsia="Noto Serif SC" w:hAnsi="Noto Serif SC" w:cs="Noto Serif"/>
-          <w:sz w:val="24"/>
-          <w:szCs w:val="24"/>
-          <w:lang w:val="en-US"/>
-        </w:rPr>
-        <w:t xml:space="preserve"> I, II)</w:t>
-      </w:r>
-    </w:p>
-    <w:p>
-      <w:pPr>
-        <w:jc w:val="right"/>
-        <w:rPr>
-          <w:rFonts w:ascii="Noto Serif SC" w:eastAsia="Noto Serif SC" w:hAnsi="Noto Serif SC" w:cs="Noto Serif"/>
-          <w:sz w:val="24"/>
-          <w:szCs w:val="24"/>
-          <w:lang w:val="en-US"/>
-        </w:rPr>
-      </w:pPr>
-      <w:r>
-        <w:rPr>
-          <w:rFonts w:ascii="Noto Serif SC" w:eastAsia="Noto Serif SC" w:hAnsi="Noto Serif SC" w:cs="Noto Serif"/>
-          <w:sz w:val="24"/>
-          <w:szCs w:val="24"/>
-          <w:lang w:val="en-US"/>
-        </w:rPr>
-        <w:t>中音唢呐 (</w:t>
+    </w:p>
+    <w:p>
+      <w:pPr>
+        <w:rPr>
+          <w:rFonts w:ascii="Noto Serif SC" w:eastAsia="Noto Serif SC" w:hAnsi="Noto Serif SC" w:cs="Noto Serif"/>
+          <w:sz w:val="24"/>
+          <w:szCs w:val="24"/>
+          <w:lang w:val="en-US"/>
+        </w:rPr>
+      </w:pPr>
+      <w:r>
+        <w:rPr>
+          <w:rFonts w:ascii="Noto Serif SC" w:eastAsia="Noto Serif SC" w:hAnsi="Noto Serif SC" w:cs="Noto Serif" w:hint="eastAsia"/>
+          <w:sz w:val="24"/>
+          <w:szCs w:val="24"/>
+          <w:lang w:val="en-US"/>
+        </w:rPr>
+        <w:t xml:space="preserve">4 琵琶 </w:t>
+      </w:r>
+      <w:r>
+        <w:rPr>
+          <w:rFonts w:ascii="Noto Serif SC" w:eastAsia="Noto Serif SC" w:hAnsi="Noto Serif SC" w:cs="Noto Serif"/>
+          <w:sz w:val="24"/>
+          <w:szCs w:val="24"/>
+          <w:lang w:val="en-US"/>
+        </w:rPr>
+        <w:t>| 4 Pipa</w:t>
+      </w:r>
+    </w:p>
+    <w:p>
+      <w:pPr>
+        <w:rPr>
+          <w:rFonts w:ascii="Noto Serif SC" w:eastAsia="Noto Serif SC" w:hAnsi="Noto Serif SC" w:cs="Noto Serif"/>
+          <w:sz w:val="24"/>
+          <w:szCs w:val="24"/>
+          <w:lang w:val="en-US"/>
+        </w:rPr>
+      </w:pPr>
+      <w:r>
+        <w:rPr>
+          <w:rFonts w:ascii="Noto Serif SC" w:eastAsia="Noto Serif SC" w:hAnsi="Noto Serif SC" w:cs="Noto Serif" w:hint="eastAsia"/>
+          <w:sz w:val="24"/>
+          <w:szCs w:val="24"/>
+          <w:lang w:val="en-US"/>
+        </w:rPr>
+        <w:t xml:space="preserve">6 中阮 </w:t>
+      </w:r>
+      <w:r>
+        <w:rPr>
+          <w:rFonts w:ascii="Noto Serif SC" w:eastAsia="Noto Serif SC" w:hAnsi="Noto Serif SC" w:cs="Noto Serif"/>
+          <w:sz w:val="24"/>
+          <w:szCs w:val="24"/>
+          <w:lang w:val="en-US"/>
+        </w:rPr>
+        <w:t>| 6 Zhong Ruan</w:t>
+      </w:r>
+    </w:p>
+    <w:p>
+      <w:pPr>
+        <w:rPr>
+          <w:rFonts w:ascii="Noto Serif SC" w:eastAsia="Noto Serif SC" w:hAnsi="Noto Serif SC" w:cs="Noto Serif"/>
+          <w:sz w:val="24"/>
+          <w:szCs w:val="24"/>
+          <w:lang w:val="en-US"/>
+        </w:rPr>
+      </w:pPr>
+      <w:r>
+        <w:rPr>
+          <w:rFonts w:ascii="Noto Serif SC" w:eastAsia="Noto Serif SC" w:hAnsi="Noto Serif SC" w:cs="Noto Serif" w:hint="eastAsia"/>
+          <w:sz w:val="24"/>
+          <w:szCs w:val="24"/>
+          <w:lang w:val="en-US"/>
+        </w:rPr>
+        <w:t xml:space="preserve">2 大阮 </w:t>
+      </w:r>
+      <w:r>
+        <w:rPr>
+          <w:rFonts w:ascii="Noto Serif SC" w:eastAsia="Noto Serif SC" w:hAnsi="Noto Serif SC" w:cs="Noto Serif"/>
+          <w:sz w:val="24"/>
+          <w:szCs w:val="24"/>
+          <w:lang w:val="en-US"/>
+        </w:rPr>
+        <w:t>| 2 Da Ruan</w:t>
+      </w:r>
+    </w:p>
+    <w:p>
+      <w:pPr>
+        <w:rPr>
+          <w:rFonts w:ascii="Noto Serif SC" w:eastAsia="Noto Serif SC" w:hAnsi="Noto Serif SC" w:cs="Noto Serif"/>
+          <w:sz w:val="24"/>
+          <w:szCs w:val="24"/>
+          <w:lang w:val="en-US"/>
+        </w:rPr>
+      </w:pPr>
+    </w:p>
+    <w:p>
+      <w:pPr>
+        <w:rPr>
+          <w:rFonts w:ascii="Noto Serif SC" w:eastAsia="Noto Serif SC" w:hAnsi="Noto Serif SC" w:cs="Noto Serif"/>
+          <w:sz w:val="24"/>
+          <w:szCs w:val="24"/>
+          <w:lang w:val="en-US"/>
+        </w:rPr>
+      </w:pPr>
+      <w:r>
+        <w:rPr>
+          <w:rFonts w:ascii="Noto Serif SC" w:eastAsia="Noto Serif SC" w:hAnsi="Noto Serif SC" w:cs="Noto Serif" w:hint="eastAsia"/>
+          <w:sz w:val="24"/>
+          <w:szCs w:val="24"/>
+          <w:lang w:val="en-US"/>
+        </w:rPr>
+        <w:t xml:space="preserve">5 打击乐 </w:t>
+      </w:r>
+      <w:r>
+        <w:rPr>
+          <w:rFonts w:ascii="Noto Serif SC" w:eastAsia="Noto Serif SC" w:hAnsi="Noto Serif SC" w:cs="Noto Serif"/>
+          <w:sz w:val="24"/>
+          <w:szCs w:val="24"/>
+          <w:lang w:val="en-US"/>
+        </w:rPr>
+        <w:t>| 5 Percussion</w:t>
+      </w:r>
+    </w:p>
+    <w:p>
+      <w:pPr>
+        <w:rPr>
+          <w:rFonts w:ascii="Noto Serif SC" w:eastAsia="Noto Serif SC" w:hAnsi="Noto Serif SC" w:cs="Noto Serif"/>
+          <w:sz w:val="24"/>
+          <w:szCs w:val="24"/>
+          <w:lang w:val="en-US"/>
+        </w:rPr>
+      </w:pPr>
+      <w:r>
+        <w:rPr>
+          <w:rFonts w:ascii="Noto Serif SC" w:eastAsia="Noto Serif SC" w:hAnsi="Noto Serif SC" w:cs="Noto Serif" w:hint="eastAsia"/>
+          <w:sz w:val="24"/>
+          <w:szCs w:val="24"/>
+          <w:lang w:val="en-US"/>
+        </w:rPr>
+        <w:t xml:space="preserve">　　</w:t>
+      </w:r>
+      <w:r>
+        <w:rPr>
+          <w:rFonts w:ascii="Noto Serif SC" w:eastAsia="Noto Serif SC" w:hAnsi="Noto Serif SC" w:cs="Noto Serif"/>
+          <w:sz w:val="24"/>
+          <w:szCs w:val="24"/>
+          <w:lang w:val="en-US"/>
+        </w:rPr>
+        <w:t xml:space="preserve">I: </w:t>
+      </w:r>
+      <w:r>
+        <w:rPr>
+          <w:rFonts w:ascii="Noto Serif SC" w:eastAsia="Noto Serif SC" w:hAnsi="Noto Serif SC" w:cs="Noto Serif" w:hint="eastAsia"/>
+          <w:sz w:val="24"/>
+          <w:szCs w:val="24"/>
+          <w:lang w:val="en-US"/>
+        </w:rPr>
+        <w:t xml:space="preserve">定音鼓,三角铁(小),沙锤,铃鼓 </w:t>
+      </w:r>
+      <w:r>
+        <w:rPr>
+          <w:rFonts w:ascii="Noto Serif SC" w:eastAsia="Noto Serif SC" w:hAnsi="Noto Serif SC" w:cs="Noto Serif"/>
+          <w:sz w:val="24"/>
+          <w:szCs w:val="24"/>
+          <w:lang w:val="en-US"/>
+        </w:rPr>
+        <w:t xml:space="preserve">| Timpani, Triangle(small), </w:t>
       </w:r>
       <w:proofErr w:type="spellStart"/>
       <w:r>
@@ -3945,7 +4313,7 @@
           <w:szCs w:val="24"/>
           <w:lang w:val="en-US"/>
         </w:rPr>
-        <w:t>Zhongyin</w:t>
+        <w:t>Maraco</w:t>
       </w:r>
       <w:proofErr w:type="spellEnd"/>
       <w:r>
@@ -3955,7 +4323,7 @@
           <w:szCs w:val="24"/>
           <w:lang w:val="en-US"/>
         </w:rPr>
-        <w:t xml:space="preserve"> </w:t>
+        <w:t xml:space="preserve">, </w:t>
       </w:r>
       <w:proofErr w:type="spellStart"/>
       <w:r>
@@ -3965,37 +4333,54 @@
           <w:szCs w:val="24"/>
           <w:lang w:val="en-US"/>
         </w:rPr>
-        <w:t>Suona</w:t>
+        <w:t>Tamburino</w:t>
       </w:r>
       <w:proofErr w:type="spellEnd"/>
-      <w:r>
-        <w:rPr>
-          <w:rFonts w:ascii="Noto Serif SC" w:eastAsia="Noto Serif SC" w:hAnsi="Noto Serif SC" w:cs="Noto Serif"/>
-          <w:sz w:val="24"/>
-          <w:szCs w:val="24"/>
-          <w:lang w:val="en-US"/>
-        </w:rPr>
-        <w:t>)</w:t>
-      </w:r>
-    </w:p>
-    <w:p>
-      <w:pPr>
-        <w:jc w:val="right"/>
-        <w:rPr>
-          <w:rFonts w:ascii="Noto Serif SC" w:eastAsia="Noto Serif SC" w:hAnsi="Noto Serif SC" w:cs="Noto Serif"/>
-          <w:sz w:val="24"/>
-          <w:szCs w:val="24"/>
-          <w:lang w:val="en-US"/>
-        </w:rPr>
-      </w:pPr>
-      <w:r>
-        <w:rPr>
-          <w:rFonts w:ascii="Noto Serif SC" w:eastAsia="Noto Serif SC" w:hAnsi="Noto Serif SC" w:cs="Noto Serif"/>
-          <w:sz w:val="24"/>
-          <w:szCs w:val="24"/>
-          <w:lang w:val="en-US"/>
-        </w:rPr>
-        <w:t>低音唢呐 (</w:t>
+    </w:p>
+    <w:p>
+      <w:pPr>
+        <w:rPr>
+          <w:rFonts w:ascii="Noto Serif SC" w:eastAsia="Noto Serif SC" w:hAnsi="Noto Serif SC" w:cs="Noto Serif"/>
+          <w:sz w:val="24"/>
+          <w:szCs w:val="24"/>
+          <w:lang w:val="en-US"/>
+        </w:rPr>
+      </w:pPr>
+      <w:r>
+        <w:rPr>
+          <w:rFonts w:ascii="Noto Serif SC" w:eastAsia="Noto Serif SC" w:hAnsi="Noto Serif SC" w:cs="Noto Serif" w:hint="eastAsia"/>
+          <w:sz w:val="24"/>
+          <w:szCs w:val="24"/>
+          <w:lang w:val="en-US"/>
+        </w:rPr>
+        <w:t xml:space="preserve">　　</w:t>
+      </w:r>
+      <w:r>
+        <w:rPr>
+          <w:rFonts w:ascii="Noto Serif SC" w:eastAsia="Noto Serif SC" w:hAnsi="Noto Serif SC" w:cs="Noto Serif"/>
+          <w:sz w:val="24"/>
+          <w:szCs w:val="24"/>
+          <w:lang w:val="en-US"/>
+        </w:rPr>
+        <w:t xml:space="preserve">II: </w:t>
+      </w:r>
+      <w:r>
+        <w:rPr>
+          <w:rFonts w:ascii="Noto Serif SC" w:eastAsia="Noto Serif SC" w:hAnsi="Noto Serif SC" w:cs="Noto Serif" w:hint="eastAsia"/>
+          <w:sz w:val="24"/>
+          <w:szCs w:val="24"/>
+          <w:lang w:val="en-US"/>
+        </w:rPr>
+        <w:t xml:space="preserve">木盒(5),低音鼓,中国大鼓,铓锣 </w:t>
+      </w:r>
+      <w:r>
+        <w:rPr>
+          <w:rFonts w:ascii="Noto Serif SC" w:eastAsia="Noto Serif SC" w:hAnsi="Noto Serif SC" w:cs="Noto Serif"/>
+          <w:sz w:val="24"/>
+          <w:szCs w:val="24"/>
+          <w:lang w:val="en-US"/>
+        </w:rPr>
+        <w:t xml:space="preserve">| Wood Block(5), Bass Drum, Chinese Drum(large), </w:t>
       </w:r>
       <w:proofErr w:type="spellStart"/>
       <w:r>
@@ -4005,7 +4390,7 @@
           <w:szCs w:val="24"/>
           <w:lang w:val="en-US"/>
         </w:rPr>
-        <w:t>Diyin</w:t>
+        <w:t>Mang</w:t>
       </w:r>
       <w:proofErr w:type="spellEnd"/>
       <w:r>
@@ -4015,7 +4400,53 @@
           <w:szCs w:val="24"/>
           <w:lang w:val="en-US"/>
         </w:rPr>
-        <w:t xml:space="preserve"> </w:t>
+        <w:t xml:space="preserve"> Gong</w:t>
+      </w:r>
+    </w:p>
+    <w:p>
+      <w:pPr>
+        <w:rPr>
+          <w:rFonts w:ascii="Noto Serif SC" w:eastAsia="Noto Serif SC" w:hAnsi="Noto Serif SC" w:cs="Noto Serif"/>
+          <w:sz w:val="24"/>
+          <w:szCs w:val="24"/>
+          <w:lang w:val="en-US"/>
+        </w:rPr>
+      </w:pPr>
+      <w:r>
+        <w:rPr>
+          <w:rFonts w:ascii="Noto Serif SC" w:eastAsia="Noto Serif SC" w:hAnsi="Noto Serif SC" w:cs="Noto Serif" w:hint="eastAsia"/>
+          <w:sz w:val="24"/>
+          <w:szCs w:val="24"/>
+          <w:lang w:val="en-US"/>
+        </w:rPr>
+        <w:t xml:space="preserve">　　</w:t>
+      </w:r>
+      <w:r>
+        <w:rPr>
+          <w:rFonts w:ascii="Noto Serif SC" w:eastAsia="Noto Serif SC" w:hAnsi="Noto Serif SC" w:cs="Noto Serif"/>
+          <w:sz w:val="24"/>
+          <w:szCs w:val="24"/>
+          <w:lang w:val="en-US"/>
+        </w:rPr>
+        <w:t xml:space="preserve">III: </w:t>
+      </w:r>
+      <w:r>
+        <w:rPr>
+          <w:rFonts w:ascii="Noto Serif SC" w:eastAsia="Noto Serif SC" w:hAnsi="Noto Serif SC" w:cs="Noto Serif" w:hint="eastAsia"/>
+          <w:sz w:val="24"/>
+          <w:szCs w:val="24"/>
+          <w:lang w:val="en-US"/>
+        </w:rPr>
+        <w:t xml:space="preserve">吊钹,竹风铃,排鼓(5),管钟 </w:t>
+      </w:r>
+      <w:r>
+        <w:rPr>
+          <w:rFonts w:ascii="Noto Serif SC" w:eastAsia="Noto Serif SC" w:hAnsi="Noto Serif SC" w:cs="Noto Serif"/>
+          <w:sz w:val="24"/>
+          <w:szCs w:val="24"/>
+          <w:lang w:val="en-US"/>
+        </w:rPr>
+        <w:t xml:space="preserve">| Suspended Cymbal, Bamboo Wind Chimes, </w:t>
       </w:r>
       <w:proofErr w:type="spellStart"/>
       <w:r>
@@ -4025,7 +4456,7 @@
           <w:szCs w:val="24"/>
           <w:lang w:val="en-US"/>
         </w:rPr>
-        <w:t>Suona</w:t>
+        <w:t>Paigu</w:t>
       </w:r>
       <w:proofErr w:type="spellEnd"/>
       <w:r>
@@ -4035,58 +4466,99 @@
           <w:szCs w:val="24"/>
           <w:lang w:val="en-US"/>
         </w:rPr>
-        <w:t>)</w:t>
-      </w:r>
-    </w:p>
-    <w:p>
-      <w:pPr>
-        <w:jc w:val="right"/>
-        <w:rPr>
-          <w:rFonts w:ascii="Noto Serif SC" w:eastAsia="Noto Serif SC" w:hAnsi="Noto Serif SC" w:cs="Noto Serif"/>
-          <w:sz w:val="24"/>
-          <w:szCs w:val="24"/>
-          <w:lang w:val="en-US"/>
-        </w:rPr>
-      </w:pPr>
-    </w:p>
-    <w:p>
-      <w:pPr>
-        <w:jc w:val="right"/>
-        <w:rPr>
-          <w:rFonts w:ascii="Noto Serif SC" w:eastAsia="Noto Serif SC" w:hAnsi="Noto Serif SC" w:cs="Noto Serif"/>
-          <w:sz w:val="24"/>
-          <w:szCs w:val="24"/>
-          <w:lang w:val="en-US"/>
-        </w:rPr>
-      </w:pPr>
-      <w:r>
-        <w:rPr>
-          <w:rFonts w:ascii="Noto Serif SC" w:eastAsia="Noto Serif SC" w:hAnsi="Noto Serif SC" w:cs="Noto Serif"/>
-          <w:sz w:val="24"/>
-          <w:szCs w:val="24"/>
-          <w:lang w:val="en-US"/>
-        </w:rPr>
-        <w:t>扬琴 (Yangqin)</w:t>
-      </w:r>
-    </w:p>
-    <w:p>
-      <w:pPr>
-        <w:jc w:val="right"/>
-        <w:rPr>
-          <w:rFonts w:ascii="Noto Serif SC" w:eastAsia="Noto Serif SC" w:hAnsi="Noto Serif SC" w:cs="Noto Serif"/>
-          <w:sz w:val="24"/>
-          <w:szCs w:val="24"/>
-          <w:lang w:val="en-US"/>
-        </w:rPr>
-      </w:pPr>
-      <w:r>
-        <w:rPr>
-          <w:rFonts w:ascii="Noto Serif SC" w:eastAsia="Noto Serif SC" w:hAnsi="Noto Serif SC" w:cs="Noto Serif"/>
-          <w:sz w:val="24"/>
-          <w:szCs w:val="24"/>
-          <w:lang w:val="en-US"/>
-        </w:rPr>
-        <w:t>柳琴 (</w:t>
+        <w:t>(5), Tubular Bell</w:t>
+      </w:r>
+    </w:p>
+    <w:p>
+      <w:pPr>
+        <w:rPr>
+          <w:rFonts w:ascii="Noto Serif SC" w:eastAsia="Noto Serif SC" w:hAnsi="Noto Serif SC" w:cs="Noto Serif"/>
+          <w:sz w:val="24"/>
+          <w:szCs w:val="24"/>
+          <w:lang w:val="en-US"/>
+        </w:rPr>
+      </w:pPr>
+      <w:r>
+        <w:rPr>
+          <w:rFonts w:ascii="Noto Serif SC" w:eastAsia="Noto Serif SC" w:hAnsi="Noto Serif SC" w:cs="Noto Serif" w:hint="eastAsia"/>
+          <w:sz w:val="24"/>
+          <w:szCs w:val="24"/>
+          <w:lang w:val="en-US"/>
+        </w:rPr>
+        <w:t xml:space="preserve">　　</w:t>
+      </w:r>
+      <w:r>
+        <w:rPr>
+          <w:rFonts w:ascii="Noto Serif SC" w:eastAsia="Noto Serif SC" w:hAnsi="Noto Serif SC" w:cs="Noto Serif"/>
+          <w:sz w:val="24"/>
+          <w:szCs w:val="24"/>
+          <w:lang w:val="en-US"/>
+        </w:rPr>
+        <w:t xml:space="preserve">IV: </w:t>
+      </w:r>
+      <w:r>
+        <w:rPr>
+          <w:rFonts w:ascii="Noto Serif SC" w:eastAsia="Noto Serif SC" w:hAnsi="Noto Serif SC" w:cs="Noto Serif" w:hint="eastAsia"/>
+          <w:sz w:val="24"/>
+          <w:szCs w:val="24"/>
+          <w:lang w:val="en-US"/>
+        </w:rPr>
+        <w:t xml:space="preserve">马林巴,钟琴,祈雨杖,音树,管钟 </w:t>
+      </w:r>
+      <w:r>
+        <w:rPr>
+          <w:rFonts w:ascii="Noto Serif SC" w:eastAsia="Noto Serif SC" w:hAnsi="Noto Serif SC" w:cs="Noto Serif"/>
+          <w:sz w:val="24"/>
+          <w:szCs w:val="24"/>
+          <w:lang w:val="en-US"/>
+        </w:rPr>
+        <w:t>| Marimba, Glockenspiel, Rain Stick, Bell Tree, Tubular Bell</w:t>
+      </w:r>
+    </w:p>
+    <w:p>
+      <w:pPr>
+        <w:rPr>
+          <w:rFonts w:ascii="Noto Serif SC" w:eastAsia="Noto Serif SC" w:hAnsi="Noto Serif SC" w:cs="Noto Serif"/>
+          <w:sz w:val="24"/>
+          <w:szCs w:val="24"/>
+          <w:lang w:val="en-US"/>
+        </w:rPr>
+      </w:pPr>
+      <w:r>
+        <w:rPr>
+          <w:rFonts w:ascii="Noto Serif SC" w:eastAsia="Noto Serif SC" w:hAnsi="Noto Serif SC" w:cs="Noto Serif" w:hint="eastAsia"/>
+          <w:sz w:val="24"/>
+          <w:szCs w:val="24"/>
+          <w:lang w:val="en-US"/>
+        </w:rPr>
+        <w:t xml:space="preserve">　　</w:t>
+      </w:r>
+      <w:r>
+        <w:rPr>
+          <w:rFonts w:ascii="Noto Serif SC" w:eastAsia="Noto Serif SC" w:hAnsi="Noto Serif SC" w:cs="Noto Serif"/>
+          <w:sz w:val="24"/>
+          <w:szCs w:val="24"/>
+          <w:lang w:val="en-US"/>
+        </w:rPr>
+        <w:t xml:space="preserve">V: </w:t>
+      </w:r>
+      <w:r>
+        <w:rPr>
+          <w:rFonts w:ascii="Noto Serif SC" w:eastAsia="Noto Serif SC" w:hAnsi="Noto Serif SC" w:cs="Noto Serif" w:hint="eastAsia"/>
+          <w:sz w:val="24"/>
+          <w:szCs w:val="24"/>
+          <w:lang w:val="en-US"/>
+        </w:rPr>
+        <w:t xml:space="preserve">颤音琴,大锣,木琴,小军鼓 </w:t>
+      </w:r>
+      <w:r>
+        <w:rPr>
+          <w:rFonts w:ascii="Noto Serif SC" w:eastAsia="Noto Serif SC" w:hAnsi="Noto Serif SC" w:cs="Noto Serif"/>
+          <w:sz w:val="24"/>
+          <w:szCs w:val="24"/>
+          <w:lang w:val="en-US"/>
+        </w:rPr>
+        <w:t xml:space="preserve">| Vibraphone, Tam-Tam, </w:t>
       </w:r>
       <w:proofErr w:type="spellStart"/>
       <w:r>
@@ -4096,7 +4568,7 @@
           <w:szCs w:val="24"/>
           <w:lang w:val="en-US"/>
         </w:rPr>
-        <w:t>Liuqin</w:t>
+        <w:t>Xylohpne</w:t>
       </w:r>
       <w:proofErr w:type="spellEnd"/>
       <w:r>
@@ -4106,577 +4578,222 @@
           <w:szCs w:val="24"/>
           <w:lang w:val="en-US"/>
         </w:rPr>
-        <w:t>)</w:t>
-      </w:r>
-    </w:p>
-    <w:p>
-      <w:pPr>
-        <w:jc w:val="right"/>
-        <w:rPr>
-          <w:rFonts w:ascii="Noto Serif SC" w:eastAsia="Noto Serif SC" w:hAnsi="Noto Serif SC" w:cs="Noto Serif"/>
-          <w:sz w:val="24"/>
-          <w:szCs w:val="24"/>
-          <w:lang w:val="en-US"/>
-        </w:rPr>
-      </w:pPr>
-      <w:r>
-        <w:rPr>
-          <w:rFonts w:ascii="Noto Serif SC" w:eastAsia="Noto Serif SC" w:hAnsi="Noto Serif SC" w:cs="Noto Serif"/>
-          <w:sz w:val="24"/>
-          <w:szCs w:val="24"/>
-          <w:lang w:val="en-US"/>
-        </w:rPr>
-        <w:t>琵琶 (Pipa)</w:t>
-      </w:r>
-    </w:p>
-    <w:p>
-      <w:pPr>
-        <w:jc w:val="right"/>
-        <w:rPr>
-          <w:rFonts w:ascii="Noto Serif SC" w:eastAsia="Noto Serif SC" w:hAnsi="Noto Serif SC" w:cs="Noto Serif"/>
-          <w:sz w:val="24"/>
-          <w:szCs w:val="24"/>
-          <w:lang w:val="en-US"/>
-        </w:rPr>
-      </w:pPr>
-      <w:r>
-        <w:rPr>
-          <w:rFonts w:ascii="Noto Serif SC" w:eastAsia="Noto Serif SC" w:hAnsi="Noto Serif SC" w:cs="Noto Serif"/>
-          <w:sz w:val="24"/>
-          <w:szCs w:val="24"/>
-          <w:lang w:val="en-US"/>
-        </w:rPr>
-        <w:t>中阮 (Zhongruan)</w:t>
-      </w:r>
-    </w:p>
-    <w:p>
-      <w:pPr>
-        <w:jc w:val="right"/>
-        <w:rPr>
-          <w:rFonts w:ascii="Noto Serif SC" w:eastAsia="Noto Serif SC" w:hAnsi="Noto Serif SC" w:cs="Noto Serif"/>
-          <w:sz w:val="24"/>
-          <w:szCs w:val="24"/>
-          <w:lang w:val="en-US"/>
-        </w:rPr>
-      </w:pPr>
-      <w:r>
-        <w:rPr>
-          <w:rFonts w:ascii="Noto Serif SC" w:eastAsia="Noto Serif SC" w:hAnsi="Noto Serif SC" w:cs="Noto Serif"/>
-          <w:sz w:val="24"/>
-          <w:szCs w:val="24"/>
-          <w:lang w:val="en-US"/>
-        </w:rPr>
-        <w:t>大阮 (Daruan)</w:t>
-      </w:r>
-    </w:p>
-    <w:p>
-      <w:pPr>
-        <w:jc w:val="right"/>
-        <w:rPr>
-          <w:rFonts w:ascii="Noto Serif SC" w:eastAsia="Noto Serif SC" w:hAnsi="Noto Serif SC" w:cs="Noto Serif"/>
-          <w:sz w:val="24"/>
-          <w:szCs w:val="24"/>
-          <w:lang w:val="en-US"/>
-        </w:rPr>
-      </w:pPr>
-    </w:p>
-    <w:p>
-      <w:pPr>
-        <w:jc w:val="right"/>
-        <w:rPr>
-          <w:rFonts w:ascii="Noto Serif SC" w:eastAsia="Noto Serif SC" w:hAnsi="Noto Serif SC" w:cs="Noto Serif"/>
-          <w:sz w:val="24"/>
-          <w:szCs w:val="24"/>
-          <w:lang w:val="en-US"/>
-        </w:rPr>
-      </w:pPr>
-      <w:r>
-        <w:rPr>
-          <w:rFonts w:ascii="Noto Serif SC" w:eastAsia="Noto Serif SC" w:hAnsi="Noto Serif SC" w:cs="Noto Serif"/>
-          <w:sz w:val="24"/>
-          <w:szCs w:val="24"/>
-          <w:lang w:val="en-US"/>
-        </w:rPr>
-        <w:t xml:space="preserve">I: </w:t>
-      </w:r>
-      <w:r>
-        <w:rPr>
-          <w:rFonts w:ascii="Noto Serif SC" w:eastAsia="Noto Serif SC" w:hAnsi="Noto Serif SC" w:cs="Noto Serif" w:hint="eastAsia"/>
-          <w:sz w:val="24"/>
-          <w:szCs w:val="24"/>
-          <w:lang w:val="en-US"/>
-        </w:rPr>
-        <w:t xml:space="preserve">定音鼓,三角铁(小),沙锤,铃鼓 </w:t>
-      </w:r>
-      <w:r>
-        <w:rPr>
-          <w:rFonts w:ascii="Noto Serif SC" w:eastAsia="Noto Serif SC" w:hAnsi="Noto Serif SC" w:cs="Noto Serif"/>
-          <w:sz w:val="24"/>
-          <w:szCs w:val="24"/>
-          <w:lang w:val="en-US"/>
-        </w:rPr>
-        <w:t xml:space="preserve">| Timpani, Triangle(small), </w:t>
-      </w:r>
-      <w:proofErr w:type="spellStart"/>
-      <w:r>
-        <w:rPr>
-          <w:rFonts w:ascii="Noto Serif SC" w:eastAsia="Noto Serif SC" w:hAnsi="Noto Serif SC" w:cs="Noto Serif"/>
-          <w:sz w:val="24"/>
-          <w:szCs w:val="24"/>
-          <w:lang w:val="en-US"/>
-        </w:rPr>
-        <w:t>Maraco</w:t>
-      </w:r>
-      <w:proofErr w:type="spellEnd"/>
-      <w:r>
-        <w:rPr>
-          <w:rFonts w:ascii="Noto Serif SC" w:eastAsia="Noto Serif SC" w:hAnsi="Noto Serif SC" w:cs="Noto Serif"/>
-          <w:sz w:val="24"/>
-          <w:szCs w:val="24"/>
-          <w:lang w:val="en-US"/>
-        </w:rPr>
-        <w:t xml:space="preserve">, </w:t>
-      </w:r>
-      <w:proofErr w:type="spellStart"/>
-      <w:r>
-        <w:rPr>
-          <w:rFonts w:ascii="Noto Serif SC" w:eastAsia="Noto Serif SC" w:hAnsi="Noto Serif SC" w:cs="Noto Serif"/>
-          <w:sz w:val="24"/>
-          <w:szCs w:val="24"/>
-          <w:lang w:val="en-US"/>
-        </w:rPr>
-        <w:t>Tamburino</w:t>
-      </w:r>
-      <w:proofErr w:type="spellEnd"/>
-    </w:p>
-    <w:p>
-      <w:pPr>
-        <w:jc w:val="right"/>
-        <w:rPr>
-          <w:rFonts w:ascii="Noto Serif SC" w:eastAsia="Noto Serif SC" w:hAnsi="Noto Serif SC" w:cs="Noto Serif"/>
-          <w:sz w:val="24"/>
-          <w:szCs w:val="24"/>
-          <w:lang w:val="en-US"/>
-        </w:rPr>
-      </w:pPr>
-      <w:r>
-        <w:rPr>
-          <w:rFonts w:ascii="Noto Serif SC" w:eastAsia="Noto Serif SC" w:hAnsi="Noto Serif SC" w:cs="Noto Serif" w:hint="eastAsia"/>
-          <w:sz w:val="24"/>
-          <w:szCs w:val="24"/>
-          <w:lang w:val="en-US"/>
-        </w:rPr>
-        <w:t xml:space="preserve">　　</w:t>
-      </w:r>
-      <w:r>
-        <w:rPr>
-          <w:rFonts w:ascii="Noto Serif SC" w:eastAsia="Noto Serif SC" w:hAnsi="Noto Serif SC" w:cs="Noto Serif"/>
-          <w:sz w:val="24"/>
-          <w:szCs w:val="24"/>
-          <w:lang w:val="en-US"/>
-        </w:rPr>
-        <w:t xml:space="preserve">II: </w:t>
-      </w:r>
-      <w:r>
-        <w:rPr>
-          <w:rFonts w:ascii="Noto Serif SC" w:eastAsia="Noto Serif SC" w:hAnsi="Noto Serif SC" w:cs="Noto Serif" w:hint="eastAsia"/>
-          <w:sz w:val="24"/>
-          <w:szCs w:val="24"/>
-          <w:lang w:val="en-US"/>
-        </w:rPr>
-        <w:t xml:space="preserve">木盒(5),低音鼓,中国大鼓,铓锣 </w:t>
-      </w:r>
-      <w:r>
-        <w:rPr>
-          <w:rFonts w:ascii="Noto Serif SC" w:eastAsia="Noto Serif SC" w:hAnsi="Noto Serif SC" w:cs="Noto Serif"/>
-          <w:sz w:val="24"/>
-          <w:szCs w:val="24"/>
-          <w:lang w:val="en-US"/>
-        </w:rPr>
-        <w:t xml:space="preserve">| Wood Block(5), Bass Drum, Chinese Drum(large), </w:t>
-      </w:r>
-      <w:proofErr w:type="spellStart"/>
-      <w:r>
-        <w:rPr>
-          <w:rFonts w:ascii="Noto Serif SC" w:eastAsia="Noto Serif SC" w:hAnsi="Noto Serif SC" w:cs="Noto Serif"/>
-          <w:sz w:val="24"/>
-          <w:szCs w:val="24"/>
-          <w:lang w:val="en-US"/>
-        </w:rPr>
-        <w:t>Mang</w:t>
-      </w:r>
-      <w:proofErr w:type="spellEnd"/>
-      <w:r>
-        <w:rPr>
-          <w:rFonts w:ascii="Noto Serif SC" w:eastAsia="Noto Serif SC" w:hAnsi="Noto Serif SC" w:cs="Noto Serif"/>
-          <w:sz w:val="24"/>
-          <w:szCs w:val="24"/>
-          <w:lang w:val="en-US"/>
-        </w:rPr>
-        <w:t xml:space="preserve"> Gong</w:t>
-      </w:r>
-    </w:p>
-    <w:p>
-      <w:pPr>
-        <w:jc w:val="right"/>
-        <w:rPr>
-          <w:rFonts w:ascii="Noto Serif SC" w:eastAsia="Noto Serif SC" w:hAnsi="Noto Serif SC" w:cs="Noto Serif"/>
-          <w:sz w:val="24"/>
-          <w:szCs w:val="24"/>
-          <w:lang w:val="en-US"/>
-        </w:rPr>
-      </w:pPr>
-      <w:r>
-        <w:rPr>
-          <w:rFonts w:ascii="Noto Serif SC" w:eastAsia="Noto Serif SC" w:hAnsi="Noto Serif SC" w:cs="Noto Serif" w:hint="eastAsia"/>
-          <w:sz w:val="24"/>
-          <w:szCs w:val="24"/>
-          <w:lang w:val="en-US"/>
-        </w:rPr>
-        <w:t xml:space="preserve">　　</w:t>
-      </w:r>
-      <w:r>
-        <w:rPr>
-          <w:rFonts w:ascii="Noto Serif SC" w:eastAsia="Noto Serif SC" w:hAnsi="Noto Serif SC" w:cs="Noto Serif"/>
-          <w:sz w:val="24"/>
-          <w:szCs w:val="24"/>
-          <w:lang w:val="en-US"/>
-        </w:rPr>
-        <w:t xml:space="preserve">III: </w:t>
-      </w:r>
-      <w:r>
-        <w:rPr>
-          <w:rFonts w:ascii="Noto Serif SC" w:eastAsia="Noto Serif SC" w:hAnsi="Noto Serif SC" w:cs="Noto Serif" w:hint="eastAsia"/>
-          <w:sz w:val="24"/>
-          <w:szCs w:val="24"/>
-          <w:lang w:val="en-US"/>
-        </w:rPr>
-        <w:t xml:space="preserve">吊钹,竹风铃,排鼓(5),管钟 </w:t>
-      </w:r>
-      <w:r>
-        <w:rPr>
-          <w:rFonts w:ascii="Noto Serif SC" w:eastAsia="Noto Serif SC" w:hAnsi="Noto Serif SC" w:cs="Noto Serif"/>
-          <w:sz w:val="24"/>
-          <w:szCs w:val="24"/>
-          <w:lang w:val="en-US"/>
-        </w:rPr>
-        <w:t xml:space="preserve">| Suspended Cymbal, Bamboo Wind Chimes, </w:t>
-      </w:r>
-      <w:proofErr w:type="spellStart"/>
-      <w:r>
-        <w:rPr>
-          <w:rFonts w:ascii="Noto Serif SC" w:eastAsia="Noto Serif SC" w:hAnsi="Noto Serif SC" w:cs="Noto Serif"/>
-          <w:sz w:val="24"/>
-          <w:szCs w:val="24"/>
-          <w:lang w:val="en-US"/>
-        </w:rPr>
-        <w:t>Paigu</w:t>
-      </w:r>
-      <w:proofErr w:type="spellEnd"/>
-      <w:r>
-        <w:rPr>
-          <w:rFonts w:ascii="Noto Serif SC" w:eastAsia="Noto Serif SC" w:hAnsi="Noto Serif SC" w:cs="Noto Serif"/>
-          <w:sz w:val="24"/>
-          <w:szCs w:val="24"/>
-          <w:lang w:val="en-US"/>
-        </w:rPr>
-        <w:t>(5), Tubular Bell</w:t>
-      </w:r>
-    </w:p>
-    <w:p>
-      <w:pPr>
-        <w:jc w:val="right"/>
-        <w:rPr>
-          <w:rFonts w:ascii="Noto Serif SC" w:eastAsia="Noto Serif SC" w:hAnsi="Noto Serif SC" w:cs="Noto Serif"/>
-          <w:sz w:val="24"/>
-          <w:szCs w:val="24"/>
-          <w:lang w:val="en-US"/>
-        </w:rPr>
-      </w:pPr>
-      <w:r>
-        <w:rPr>
-          <w:rFonts w:ascii="Noto Serif SC" w:eastAsia="Noto Serif SC" w:hAnsi="Noto Serif SC" w:cs="Noto Serif" w:hint="eastAsia"/>
-          <w:sz w:val="24"/>
-          <w:szCs w:val="24"/>
-          <w:lang w:val="en-US"/>
-        </w:rPr>
-        <w:t xml:space="preserve">　　</w:t>
-      </w:r>
-      <w:r>
-        <w:rPr>
-          <w:rFonts w:ascii="Noto Serif SC" w:eastAsia="Noto Serif SC" w:hAnsi="Noto Serif SC" w:cs="Noto Serif"/>
-          <w:sz w:val="24"/>
-          <w:szCs w:val="24"/>
-          <w:lang w:val="en-US"/>
-        </w:rPr>
-        <w:t xml:space="preserve">IV: </w:t>
-      </w:r>
-      <w:r>
-        <w:rPr>
-          <w:rFonts w:ascii="Noto Serif SC" w:eastAsia="Noto Serif SC" w:hAnsi="Noto Serif SC" w:cs="Noto Serif" w:hint="eastAsia"/>
-          <w:sz w:val="24"/>
-          <w:szCs w:val="24"/>
-          <w:lang w:val="en-US"/>
-        </w:rPr>
-        <w:t xml:space="preserve">马林巴,钟琴,祈雨杖,音树,管钟 </w:t>
-      </w:r>
-      <w:r>
-        <w:rPr>
-          <w:rFonts w:ascii="Noto Serif SC" w:eastAsia="Noto Serif SC" w:hAnsi="Noto Serif SC" w:cs="Noto Serif"/>
-          <w:sz w:val="24"/>
-          <w:szCs w:val="24"/>
-          <w:lang w:val="en-US"/>
-        </w:rPr>
-        <w:t>| Marimba, Glockenspiel, Rain Stick, Bell Tree, Tubular Bell</w:t>
-      </w:r>
-    </w:p>
-    <w:p>
-      <w:pPr>
-        <w:jc w:val="right"/>
-        <w:rPr>
-          <w:rFonts w:ascii="Noto Serif SC" w:eastAsia="Noto Serif SC" w:hAnsi="Noto Serif SC" w:cs="Noto Serif"/>
-          <w:sz w:val="24"/>
-          <w:szCs w:val="24"/>
-          <w:lang w:val="en-US"/>
-        </w:rPr>
-      </w:pPr>
-      <w:r>
-        <w:rPr>
-          <w:rFonts w:ascii="Noto Serif SC" w:eastAsia="Noto Serif SC" w:hAnsi="Noto Serif SC" w:cs="Noto Serif" w:hint="eastAsia"/>
-          <w:sz w:val="24"/>
-          <w:szCs w:val="24"/>
-          <w:lang w:val="en-US"/>
-        </w:rPr>
-        <w:t xml:space="preserve">　　</w:t>
-      </w:r>
-      <w:r>
-        <w:rPr>
-          <w:rFonts w:ascii="Noto Serif SC" w:eastAsia="Noto Serif SC" w:hAnsi="Noto Serif SC" w:cs="Noto Serif"/>
-          <w:sz w:val="24"/>
-          <w:szCs w:val="24"/>
-          <w:lang w:val="en-US"/>
-        </w:rPr>
-        <w:t xml:space="preserve">V: </w:t>
-      </w:r>
-      <w:r>
-        <w:rPr>
-          <w:rFonts w:ascii="Noto Serif SC" w:eastAsia="Noto Serif SC" w:hAnsi="Noto Serif SC" w:cs="Noto Serif" w:hint="eastAsia"/>
-          <w:sz w:val="24"/>
-          <w:szCs w:val="24"/>
-          <w:lang w:val="en-US"/>
-        </w:rPr>
-        <w:t xml:space="preserve">颤音琴,大锣,木琴,小军鼓 </w:t>
-      </w:r>
-      <w:r>
-        <w:rPr>
-          <w:rFonts w:ascii="Noto Serif SC" w:eastAsia="Noto Serif SC" w:hAnsi="Noto Serif SC" w:cs="Noto Serif"/>
-          <w:sz w:val="24"/>
-          <w:szCs w:val="24"/>
-          <w:lang w:val="en-US"/>
-        </w:rPr>
-        <w:t xml:space="preserve">| Vibraphone, Tam-Tam, </w:t>
-      </w:r>
-      <w:proofErr w:type="spellStart"/>
-      <w:r>
-        <w:rPr>
-          <w:rFonts w:ascii="Noto Serif SC" w:eastAsia="Noto Serif SC" w:hAnsi="Noto Serif SC" w:cs="Noto Serif"/>
-          <w:sz w:val="24"/>
-          <w:szCs w:val="24"/>
-          <w:lang w:val="en-US"/>
-        </w:rPr>
-        <w:t>Xylohpne</w:t>
-      </w:r>
-      <w:proofErr w:type="spellEnd"/>
-      <w:r>
-        <w:rPr>
-          <w:rFonts w:ascii="Noto Serif SC" w:eastAsia="Noto Serif SC" w:hAnsi="Noto Serif SC" w:cs="Noto Serif"/>
-          <w:sz w:val="24"/>
-          <w:szCs w:val="24"/>
-          <w:lang w:val="en-US"/>
-        </w:rPr>
         <w:t>, Snare Drum</w:t>
       </w:r>
     </w:p>
     <w:p>
       <w:pPr>
-        <w:jc w:val="right"/>
-        <w:rPr>
-          <w:rFonts w:ascii="Noto Serif SC" w:eastAsia="Noto Serif SC" w:hAnsi="Noto Serif SC" w:cs="Noto Serif"/>
-          <w:sz w:val="24"/>
-          <w:szCs w:val="24"/>
-          <w:lang w:val="en-US"/>
-        </w:rPr>
-      </w:pPr>
-    </w:p>
-    <w:p>
-      <w:pPr>
-        <w:jc w:val="right"/>
-        <w:rPr>
-          <w:rFonts w:ascii="Noto Serif SC" w:eastAsia="Noto Serif SC" w:hAnsi="Noto Serif SC" w:cs="Noto Serif"/>
-          <w:sz w:val="24"/>
-          <w:szCs w:val="24"/>
-          <w:lang w:val="en-US"/>
-        </w:rPr>
-      </w:pPr>
-      <w:r>
-        <w:rPr>
-          <w:rFonts w:ascii="Noto Serif SC" w:eastAsia="Noto Serif SC" w:hAnsi="Noto Serif SC" w:cs="Noto Serif"/>
-          <w:sz w:val="24"/>
-          <w:szCs w:val="24"/>
-          <w:lang w:val="en-US"/>
-        </w:rPr>
-        <w:t>竖琴 (Harp)</w:t>
-      </w:r>
-    </w:p>
-    <w:p>
-      <w:pPr>
-        <w:jc w:val="right"/>
-        <w:rPr>
-          <w:rFonts w:ascii="Noto Serif SC" w:eastAsia="Noto Serif SC" w:hAnsi="Noto Serif SC" w:cs="Noto Serif"/>
-          <w:sz w:val="24"/>
-          <w:szCs w:val="24"/>
-          <w:lang w:val="en-US"/>
-        </w:rPr>
-      </w:pPr>
-    </w:p>
-    <w:p>
-      <w:pPr>
-        <w:jc w:val="right"/>
-        <w:rPr>
-          <w:rFonts w:ascii="Noto Serif SC" w:eastAsia="Noto Serif SC" w:hAnsi="Noto Serif SC" w:cs="Noto Serif"/>
-          <w:sz w:val="24"/>
-          <w:szCs w:val="24"/>
-          <w:lang w:val="en-US"/>
-        </w:rPr>
-      </w:pPr>
-      <w:r>
-        <w:rPr>
-          <w:rFonts w:ascii="Noto Serif SC" w:eastAsia="Noto Serif SC" w:hAnsi="Noto Serif SC" w:cs="Noto Serif"/>
-          <w:sz w:val="24"/>
-          <w:szCs w:val="24"/>
-          <w:lang w:val="en-US"/>
-        </w:rPr>
-        <w:t>笛子独奏 (Dizi Solo)</w:t>
-      </w:r>
-    </w:p>
-    <w:p>
-      <w:pPr>
-        <w:jc w:val="right"/>
-        <w:rPr>
-          <w:rFonts w:ascii="Noto Serif SC" w:eastAsia="Noto Serif SC" w:hAnsi="Noto Serif SC" w:cs="Noto Serif"/>
-          <w:sz w:val="24"/>
-          <w:szCs w:val="24"/>
-          <w:lang w:val="en-US"/>
-        </w:rPr>
-      </w:pPr>
-    </w:p>
-    <w:p>
-      <w:pPr>
-        <w:jc w:val="right"/>
-        <w:rPr>
-          <w:rFonts w:ascii="Noto Serif SC" w:eastAsia="Noto Serif SC" w:hAnsi="Noto Serif SC" w:cs="Noto Serif"/>
-          <w:sz w:val="24"/>
-          <w:szCs w:val="24"/>
-          <w:lang w:val="en-US"/>
-        </w:rPr>
-      </w:pPr>
-      <w:r>
-        <w:rPr>
-          <w:rFonts w:ascii="Noto Serif SC" w:eastAsia="Noto Serif SC" w:hAnsi="Noto Serif SC" w:cs="Noto Serif"/>
-          <w:sz w:val="24"/>
-          <w:szCs w:val="24"/>
-          <w:lang w:val="en-US"/>
-        </w:rPr>
-        <w:t>高胡 (Gaohu)</w:t>
-      </w:r>
-    </w:p>
-    <w:p>
-      <w:pPr>
-        <w:jc w:val="right"/>
-        <w:rPr>
-          <w:rFonts w:ascii="Noto Serif SC" w:eastAsia="Noto Serif SC" w:hAnsi="Noto Serif SC" w:cs="Noto Serif"/>
-          <w:sz w:val="24"/>
-          <w:szCs w:val="24"/>
-          <w:lang w:val="en-US"/>
-        </w:rPr>
-      </w:pPr>
-      <w:r>
-        <w:rPr>
-          <w:rFonts w:ascii="Noto Serif SC" w:eastAsia="Noto Serif SC" w:hAnsi="Noto Serif SC" w:cs="Noto Serif"/>
-          <w:sz w:val="24"/>
-          <w:szCs w:val="24"/>
-          <w:lang w:val="en-US"/>
-        </w:rPr>
-        <w:t>二胡 (Erhu)</w:t>
-      </w:r>
-    </w:p>
-    <w:p>
-      <w:pPr>
-        <w:jc w:val="right"/>
-        <w:rPr>
-          <w:rFonts w:ascii="Noto Serif SC" w:eastAsia="Noto Serif SC" w:hAnsi="Noto Serif SC" w:cs="Noto Serif"/>
-          <w:sz w:val="24"/>
-          <w:szCs w:val="24"/>
-          <w:lang w:val="en-US"/>
-        </w:rPr>
-      </w:pPr>
-      <w:r>
-        <w:rPr>
-          <w:rFonts w:ascii="Noto Serif SC" w:eastAsia="Noto Serif SC" w:hAnsi="Noto Serif SC" w:cs="Noto Serif"/>
-          <w:sz w:val="24"/>
-          <w:szCs w:val="24"/>
-          <w:lang w:val="en-US"/>
-        </w:rPr>
-        <w:t>中胡 (Zhonghu)</w:t>
-      </w:r>
-    </w:p>
-    <w:p>
-      <w:pPr>
-        <w:jc w:val="right"/>
-        <w:rPr>
-          <w:rFonts w:ascii="Noto Serif SC" w:eastAsia="Noto Serif SC" w:hAnsi="Noto Serif SC" w:cs="Noto Serif"/>
-          <w:sz w:val="24"/>
-          <w:szCs w:val="24"/>
-          <w:lang w:val="en-US"/>
-        </w:rPr>
-      </w:pPr>
-      <w:r>
-        <w:rPr>
-          <w:rFonts w:ascii="Noto Serif SC" w:eastAsia="Noto Serif SC" w:hAnsi="Noto Serif SC" w:cs="Noto Serif"/>
-          <w:sz w:val="24"/>
-          <w:szCs w:val="24"/>
-          <w:lang w:val="en-US"/>
-        </w:rPr>
-        <w:t>大提琴 (Violoncello)</w:t>
-      </w:r>
-    </w:p>
-    <w:p>
-      <w:pPr>
-        <w:jc w:val="right"/>
-        <w:rPr>
-          <w:rFonts w:ascii="Noto Serif SC" w:eastAsia="Noto Serif SC" w:hAnsi="Noto Serif SC" w:cs="Noto Serif"/>
-          <w:sz w:val="24"/>
-          <w:szCs w:val="24"/>
-          <w:lang w:val="en-US"/>
-        </w:rPr>
-      </w:pPr>
-      <w:r>
-        <w:rPr>
-          <w:rFonts w:ascii="Noto Serif SC" w:eastAsia="Noto Serif SC" w:hAnsi="Noto Serif SC" w:cs="Noto Serif"/>
-          <w:sz w:val="24"/>
-          <w:szCs w:val="24"/>
-          <w:lang w:val="en-US"/>
-        </w:rPr>
-        <w:t>低音提琴 (Contrabass)</w:t>
-      </w:r>
-    </w:p>
-    <w:p>
-      <w:pPr>
-        <w:rPr>
-          <w:rFonts w:ascii="Noto Serif SC" w:eastAsia="Noto Serif SC" w:hAnsi="Noto Serif SC" w:cs="Noto Serif"/>
-          <w:lang w:val="en-US"/>
-        </w:rPr>
-      </w:pPr>
+        <w:rPr>
+          <w:rFonts w:ascii="Noto Serif SC" w:eastAsia="Noto Serif SC" w:hAnsi="Noto Serif SC" w:cs="Noto Serif"/>
+          <w:sz w:val="24"/>
+          <w:szCs w:val="24"/>
+          <w:lang w:val="en-US"/>
+        </w:rPr>
+      </w:pPr>
+    </w:p>
+    <w:p>
+      <w:pPr>
+        <w:rPr>
+          <w:rFonts w:ascii="Noto Serif SC" w:eastAsia="Noto Serif SC" w:hAnsi="Noto Serif SC" w:cs="Noto Serif"/>
+          <w:sz w:val="24"/>
+          <w:szCs w:val="24"/>
+          <w:lang w:val="en-US"/>
+        </w:rPr>
+      </w:pPr>
+      <w:r>
+        <w:rPr>
+          <w:rFonts w:ascii="Noto Serif SC" w:eastAsia="Noto Serif SC" w:hAnsi="Noto Serif SC" w:cs="Noto Serif" w:hint="eastAsia"/>
+          <w:sz w:val="24"/>
+          <w:szCs w:val="24"/>
+          <w:lang w:val="en-US"/>
+        </w:rPr>
+        <w:t xml:space="preserve">1 竖琴 </w:t>
+      </w:r>
+      <w:r>
+        <w:rPr>
+          <w:rFonts w:ascii="Noto Serif SC" w:eastAsia="Noto Serif SC" w:hAnsi="Noto Serif SC" w:cs="Noto Serif"/>
+          <w:sz w:val="24"/>
+          <w:szCs w:val="24"/>
+          <w:lang w:val="en-US"/>
+        </w:rPr>
+        <w:t>| 1 Harp</w:t>
+      </w:r>
+    </w:p>
+    <w:p>
+      <w:pPr>
+        <w:rPr>
+          <w:rFonts w:ascii="Noto Serif SC" w:eastAsia="Noto Serif SC" w:hAnsi="Noto Serif SC" w:cs="Noto Serif"/>
+          <w:sz w:val="24"/>
+          <w:szCs w:val="24"/>
+          <w:lang w:val="en-US"/>
+        </w:rPr>
+      </w:pPr>
+    </w:p>
+    <w:p>
+      <w:pPr>
+        <w:rPr>
+          <w:rFonts w:ascii="Noto Serif SC" w:eastAsia="Noto Serif SC" w:hAnsi="Noto Serif SC" w:cs="Noto Serif"/>
+          <w:sz w:val="24"/>
+          <w:szCs w:val="24"/>
+          <w:lang w:val="en-US"/>
+        </w:rPr>
+      </w:pPr>
+      <w:r>
+        <w:rPr>
+          <w:rFonts w:ascii="Noto Serif SC" w:eastAsia="Noto Serif SC" w:hAnsi="Noto Serif SC" w:cs="Noto Serif" w:hint="eastAsia"/>
+          <w:sz w:val="24"/>
+          <w:szCs w:val="24"/>
+          <w:lang w:val="en-US"/>
+        </w:rPr>
+        <w:t xml:space="preserve">8 高胡 </w:t>
+      </w:r>
+      <w:r>
+        <w:rPr>
+          <w:rFonts w:ascii="Noto Serif SC" w:eastAsia="Noto Serif SC" w:hAnsi="Noto Serif SC" w:cs="Noto Serif"/>
+          <w:sz w:val="24"/>
+          <w:szCs w:val="24"/>
+          <w:lang w:val="en-US"/>
+        </w:rPr>
+        <w:t>| 8 Gaohu</w:t>
+      </w:r>
+    </w:p>
+    <w:p>
+      <w:pPr>
+        <w:rPr>
+          <w:rFonts w:ascii="Noto Serif SC" w:eastAsia="Noto Serif SC" w:hAnsi="Noto Serif SC" w:cs="Noto Serif"/>
+          <w:sz w:val="24"/>
+          <w:szCs w:val="24"/>
+          <w:lang w:val="en-US"/>
+        </w:rPr>
+      </w:pPr>
+      <w:r>
+        <w:rPr>
+          <w:rFonts w:ascii="Noto Serif SC" w:eastAsia="Noto Serif SC" w:hAnsi="Noto Serif SC" w:cs="Noto Serif" w:hint="eastAsia"/>
+          <w:sz w:val="24"/>
+          <w:szCs w:val="24"/>
+          <w:lang w:val="en-US"/>
+        </w:rPr>
+        <w:t xml:space="preserve">7 二胡I </w:t>
+      </w:r>
+      <w:r>
+        <w:rPr>
+          <w:rFonts w:ascii="Noto Serif SC" w:eastAsia="Noto Serif SC" w:hAnsi="Noto Serif SC" w:cs="Noto Serif"/>
+          <w:sz w:val="24"/>
+          <w:szCs w:val="24"/>
+          <w:lang w:val="en-US"/>
+        </w:rPr>
+        <w:t>| 7 Erhu I</w:t>
+      </w:r>
+    </w:p>
+    <w:p>
+      <w:pPr>
+        <w:rPr>
+          <w:rFonts w:ascii="Noto Serif SC" w:eastAsia="Noto Serif SC" w:hAnsi="Noto Serif SC" w:cs="Noto Serif"/>
+          <w:sz w:val="24"/>
+          <w:szCs w:val="24"/>
+          <w:lang w:val="en-US"/>
+        </w:rPr>
+      </w:pPr>
+      <w:r>
+        <w:rPr>
+          <w:rFonts w:ascii="Noto Serif SC" w:eastAsia="Noto Serif SC" w:hAnsi="Noto Serif SC" w:cs="Noto Serif" w:hint="eastAsia"/>
+          <w:sz w:val="24"/>
+          <w:szCs w:val="24"/>
+          <w:lang w:val="en-US"/>
+        </w:rPr>
+        <w:t xml:space="preserve">6 二胡II </w:t>
+      </w:r>
+      <w:r>
+        <w:rPr>
+          <w:rFonts w:ascii="Noto Serif SC" w:eastAsia="Noto Serif SC" w:hAnsi="Noto Serif SC" w:cs="Noto Serif"/>
+          <w:sz w:val="24"/>
+          <w:szCs w:val="24"/>
+          <w:lang w:val="en-US"/>
+        </w:rPr>
+        <w:t>| 6 Erhu II</w:t>
+      </w:r>
+    </w:p>
+    <w:p>
+      <w:pPr>
+        <w:rPr>
+          <w:rFonts w:ascii="Noto Serif SC" w:eastAsia="Noto Serif SC" w:hAnsi="Noto Serif SC" w:cs="Noto Serif"/>
+          <w:sz w:val="24"/>
+          <w:szCs w:val="24"/>
+          <w:lang w:val="en-US"/>
+        </w:rPr>
+      </w:pPr>
+      <w:r>
+        <w:rPr>
+          <w:rFonts w:ascii="Noto Serif SC" w:eastAsia="Noto Serif SC" w:hAnsi="Noto Serif SC" w:cs="Noto Serif" w:hint="eastAsia"/>
+          <w:sz w:val="24"/>
+          <w:szCs w:val="24"/>
+          <w:lang w:val="en-US"/>
+        </w:rPr>
+        <w:t xml:space="preserve">7 中胡 </w:t>
+      </w:r>
+      <w:r>
+        <w:rPr>
+          <w:rFonts w:ascii="Noto Serif SC" w:eastAsia="Noto Serif SC" w:hAnsi="Noto Serif SC" w:cs="Noto Serif"/>
+          <w:sz w:val="24"/>
+          <w:szCs w:val="24"/>
+          <w:lang w:val="en-US"/>
+        </w:rPr>
+        <w:t>| 7 Zhonghu</w:t>
+      </w:r>
+    </w:p>
+    <w:p>
+      <w:pPr>
+        <w:rPr>
+          <w:rFonts w:ascii="Noto Serif SC" w:eastAsia="Noto Serif SC" w:hAnsi="Noto Serif SC" w:cs="Noto Serif"/>
+          <w:sz w:val="24"/>
+          <w:szCs w:val="24"/>
+          <w:lang w:val="en-US"/>
+        </w:rPr>
+      </w:pPr>
+      <w:r>
+        <w:rPr>
+          <w:rFonts w:ascii="Noto Serif SC" w:eastAsia="Noto Serif SC" w:hAnsi="Noto Serif SC" w:cs="Noto Serif" w:hint="eastAsia"/>
+          <w:sz w:val="24"/>
+          <w:szCs w:val="24"/>
+          <w:lang w:val="en-US"/>
+        </w:rPr>
+        <w:t xml:space="preserve">6 大提琴 </w:t>
+      </w:r>
+      <w:r>
+        <w:rPr>
+          <w:rFonts w:ascii="Noto Serif SC" w:eastAsia="Noto Serif SC" w:hAnsi="Noto Serif SC" w:cs="Noto Serif"/>
+          <w:sz w:val="24"/>
+          <w:szCs w:val="24"/>
+          <w:lang w:val="en-US"/>
+        </w:rPr>
+        <w:t>| 6 Violoncello</w:t>
+      </w:r>
+    </w:p>
+    <w:p>
+      <w:pPr>
+        <w:rPr>
+          <w:rFonts w:ascii="Noto Serif SC" w:eastAsia="Noto Serif SC" w:hAnsi="Noto Serif SC" w:cs="Noto Serif"/>
+          <w:lang w:val="en-US"/>
+        </w:rPr>
+      </w:pPr>
+      <w:r>
+        <w:rPr>
+          <w:rFonts w:ascii="Noto Serif SC" w:eastAsia="Noto Serif SC" w:hAnsi="Noto Serif SC" w:cs="Noto Serif" w:hint="eastAsia"/>
+          <w:sz w:val="24"/>
+          <w:szCs w:val="24"/>
+          <w:lang w:val="en-US"/>
+        </w:rPr>
+        <w:t xml:space="preserve">4 低音提琴 </w:t>
+      </w:r>
+      <w:r>
+        <w:rPr>
+          <w:rFonts w:ascii="Noto Serif SC" w:eastAsia="Noto Serif SC" w:hAnsi="Noto Serif SC" w:cs="Noto Serif"/>
+          <w:sz w:val="24"/>
+          <w:szCs w:val="24"/>
+          <w:lang w:val="en-US"/>
+        </w:rPr>
+        <w:t>| 4 Double Bass</w:t>
+      </w:r>
     </w:p>
     <w:p>
       <w:pPr>

</xml_diff>